<commit_message>
Authorization form: titles inside cards, no emergency contact, time zone dropdown, standard-hours switch
</commit_message>
<xml_diff>
--- a/clients/_templates/LeBlanc-Security-Testing-Authorization.docx
+++ b/clients/_templates/LeBlanc-Security-Testing-Authorization.docx
@@ -420,157 +420,6 @@
     </w:tbl>
     <w:p>
       <w:pPr>
-        <w:spacing w:after="0" w:before="160"/>
-      </w:pPr>
-      <w:r>
-        <w:rPr>
-          <w:rFonts w:ascii="Arial" w:cs="Arial" w:eastAsia="Arial" w:hAnsi="Arial"/>
-          <w:color w:val="5A6B78"/>
-          <w:sz w:val="18"/>
-          <w:szCs w:val="18"/>
-        </w:rPr>
-        <w:t xml:space="preserve">Emergency contact during testing (if different):</w:t>
-      </w:r>
-    </w:p>
-    <w:tbl>
-      <w:tblPr>
-        <w:tblW w:type="dxa" w:w="9360"/>
-        <w:tblBorders>
-          <w:top w:val="none" w:color="FFFFFF" w:sz="0"/>
-          <w:left w:val="none" w:color="FFFFFF" w:sz="0"/>
-          <w:bottom w:val="none" w:color="FFFFFF" w:sz="0"/>
-          <w:right w:val="none" w:color="FFFFFF" w:sz="0"/>
-          <w:insideH w:val="none" w:color="FFFFFF" w:sz="0"/>
-          <w:insideV w:val="none" w:color="FFFFFF" w:sz="0"/>
-        </w:tblBorders>
-      </w:tblPr>
-      <w:tblGrid>
-        <w:gridCol w:w="1500"/>
-        <w:gridCol w:w="3660"/>
-        <w:gridCol w:w="1344"/>
-        <w:gridCol w:w="2856"/>
-      </w:tblGrid>
-      <w:tr>
-        <w:tc>
-          <w:tcPr>
-            <w:tcW w:type="dxa" w:w="1500"/>
-            <w:tcBorders>
-              <w:top w:val="none" w:color="FFFFFF" w:sz="0"/>
-              <w:left w:val="none" w:color="FFFFFF" w:sz="0"/>
-              <w:bottom w:val="none" w:color="FFFFFF" w:sz="0"/>
-              <w:right w:val="none" w:color="FFFFFF" w:sz="0"/>
-            </w:tcBorders>
-            <w:tcMar>
-              <w:top w:type="dxa" w:w="120"/>
-              <w:left w:type="dxa" w:w="0"/>
-              <w:bottom w:type="dxa" w:w="20"/>
-              <w:right w:type="dxa" w:w="80"/>
-            </w:tcMar>
-          </w:tcPr>
-          <w:p>
-            <w:r>
-              <w:rPr>
-                <w:rFonts w:ascii="Arial" w:cs="Arial" w:eastAsia="Arial" w:hAnsi="Arial"/>
-                <w:b/>
-                <w:bCs/>
-                <w:color w:val="5A6B78"/>
-                <w:sz w:val="18"/>
-                <w:szCs w:val="18"/>
-              </w:rPr>
-              <w:t xml:space="preserve">Name</w:t>
-            </w:r>
-          </w:p>
-        </w:tc>
-        <w:tc>
-          <w:tcPr>
-            <w:tcW w:type="dxa" w:w="3660"/>
-            <w:tcBorders>
-              <w:top w:val="none" w:color="FFFFFF" w:sz="0"/>
-              <w:left w:val="none" w:color="FFFFFF" w:sz="0"/>
-              <w:bottom w:val="single" w:color="5A6B78" w:sz="6"/>
-              <w:right w:val="none" w:color="FFFFFF" w:sz="0"/>
-            </w:tcBorders>
-            <w:tcMar>
-              <w:top w:type="dxa" w:w="120"/>
-              <w:left w:type="dxa" w:w="60"/>
-              <w:bottom w:type="dxa" w:w="20"/>
-              <w:right w:type="dxa" w:w="160"/>
-            </w:tcMar>
-          </w:tcPr>
-          <w:p>
-            <w:r>
-              <w:rPr>
-                <w:rFonts w:ascii="Arial" w:cs="Arial" w:eastAsia="Arial" w:hAnsi="Arial"/>
-                <w:color w:val="15232E"/>
-                <w:sz w:val="20"/>
-                <w:szCs w:val="20"/>
-              </w:rPr>
-              <w:t xml:space="preserve"/>
-            </w:r>
-          </w:p>
-        </w:tc>
-        <w:tc>
-          <w:tcPr>
-            <w:tcW w:type="dxa" w:w="1344"/>
-            <w:tcBorders>
-              <w:top w:val="none" w:color="FFFFFF" w:sz="0"/>
-              <w:left w:val="none" w:color="FFFFFF" w:sz="0"/>
-              <w:bottom w:val="none" w:color="FFFFFF" w:sz="0"/>
-              <w:right w:val="none" w:color="FFFFFF" w:sz="0"/>
-            </w:tcBorders>
-            <w:tcMar>
-              <w:top w:type="dxa" w:w="120"/>
-              <w:left w:type="dxa" w:w="0"/>
-              <w:bottom w:type="dxa" w:w="20"/>
-              <w:right w:type="dxa" w:w="80"/>
-            </w:tcMar>
-          </w:tcPr>
-          <w:p>
-            <w:r>
-              <w:rPr>
-                <w:rFonts w:ascii="Arial" w:cs="Arial" w:eastAsia="Arial" w:hAnsi="Arial"/>
-                <w:b/>
-                <w:bCs/>
-                <w:color w:val="5A6B78"/>
-                <w:sz w:val="18"/>
-                <w:szCs w:val="18"/>
-              </w:rPr>
-              <w:t xml:space="preserve">Phone</w:t>
-            </w:r>
-          </w:p>
-        </w:tc>
-        <w:tc>
-          <w:tcPr>
-            <w:tcW w:type="dxa" w:w="2856"/>
-            <w:tcBorders>
-              <w:top w:val="none" w:color="FFFFFF" w:sz="0"/>
-              <w:left w:val="none" w:color="FFFFFF" w:sz="0"/>
-              <w:bottom w:val="single" w:color="5A6B78" w:sz="6"/>
-              <w:right w:val="none" w:color="FFFFFF" w:sz="0"/>
-            </w:tcBorders>
-            <w:tcMar>
-              <w:top w:type="dxa" w:w="120"/>
-              <w:left w:type="dxa" w:w="60"/>
-              <w:bottom w:type="dxa" w:w="20"/>
-              <w:right w:type="dxa" w:w="160"/>
-            </w:tcMar>
-          </w:tcPr>
-          <w:p>
-            <w:r>
-              <w:rPr>
-                <w:rFonts w:ascii="Arial" w:cs="Arial" w:eastAsia="Arial" w:hAnsi="Arial"/>
-                <w:color w:val="15232E"/>
-                <w:sz w:val="20"/>
-                <w:szCs w:val="20"/>
-              </w:rPr>
-              <w:t xml:space="preserve"/>
-            </w:r>
-          </w:p>
-        </w:tc>
-      </w:tr>
-    </w:tbl>
-    <w:p>
-      <w:pPr>
         <w:keepNext/>
         <w:pBdr>
           <w:bottom w:val="single" w:color="D3DCE2" w:sz="6" w:space="4"/>
@@ -1252,6 +1101,61 @@
         </w:tc>
       </w:tr>
     </w:tbl>
+    <w:p>
+      <w:pPr>
+        <w:spacing w:before="160"/>
+      </w:pPr>
+    </w:p>
+    <w:p>
+      <w:pPr>
+        <w:spacing w:after="100" w:line="264"/>
+        <w:ind w:left="360" w:hanging="360"/>
+      </w:pPr>
+      <w:r>
+        <w:rPr>
+          <w:rFonts w:ascii="Arial" w:cs="Arial" w:eastAsia="Arial" w:hAnsi="Arial"/>
+          <w:color w:val="15232E"/>
+          <w:sz w:val="26"/>
+          <w:szCs w:val="26"/>
+        </w:rPr>
+        <w:t xml:space="preserve">☐  </w:t>
+      </w:r>
+      <w:r>
+        <w:rPr>
+          <w:rFonts w:ascii="Arial" w:cs="Arial" w:eastAsia="Arial" w:hAnsi="Arial"/>
+          <w:b/>
+          <w:bCs/>
+          <w:color w:val="15232E"/>
+          <w:sz w:val="20"/>
+          <w:szCs w:val="20"/>
+        </w:rPr>
+        <w:t xml:space="preserve">Standard hours</w:t>
+      </w:r>
+      <w:r>
+        <w:rPr>
+          <w:rFonts w:ascii="Arial" w:cs="Arial" w:eastAsia="Arial" w:hAnsi="Arial"/>
+          <w:color w:val="15232E"/>
+          <w:sz w:val="20"/>
+          <w:szCs w:val="20"/>
+        </w:rPr>
+        <w:t xml:space="preserve"> — test after business hours: weekdays 6 pm to 7 am, and weekends.</w:t>
+      </w:r>
+    </w:p>
+    <w:p>
+      <w:pPr>
+        <w:spacing w:after="100" w:line="276"/>
+        <w:ind w:left="360"/>
+      </w:pPr>
+      <w:r>
+        <w:rPr>
+          <w:rFonts w:ascii="Arial" w:cs="Arial" w:eastAsia="Arial" w:hAnsi="Arial"/>
+          <w:color w:val="5A6B78"/>
+          <w:sz w:val="20"/>
+          <w:szCs w:val="20"/>
+        </w:rPr>
+        <w:t xml:space="preserve">Or allowed hours: ________________________________</w:t>
+      </w:r>
+    </w:p>
     <w:tbl>
       <w:tblPr>
         <w:tblW w:type="dxa" w:w="9360"/>
@@ -1267,8 +1171,6 @@
       <w:tblGrid>
         <w:gridCol w:w="1500"/>
         <w:gridCol w:w="3180"/>
-        <w:gridCol w:w="1498"/>
-        <w:gridCol w:w="3182"/>
       </w:tblGrid>
       <w:tr>
         <w:tc>
@@ -1297,71 +1199,13 @@
                 <w:sz w:val="18"/>
                 <w:szCs w:val="18"/>
               </w:rPr>
-              <w:t xml:space="preserve">Allowed hours</w:t>
+              <w:t xml:space="preserve">Time zone</w:t>
             </w:r>
           </w:p>
         </w:tc>
         <w:tc>
           <w:tcPr>
             <w:tcW w:type="dxa" w:w="3180"/>
-            <w:tcBorders>
-              <w:top w:val="none" w:color="FFFFFF" w:sz="0"/>
-              <w:left w:val="none" w:color="FFFFFF" w:sz="0"/>
-              <w:bottom w:val="single" w:color="5A6B78" w:sz="6"/>
-              <w:right w:val="none" w:color="FFFFFF" w:sz="0"/>
-            </w:tcBorders>
-            <w:tcMar>
-              <w:top w:type="dxa" w:w="120"/>
-              <w:left w:type="dxa" w:w="60"/>
-              <w:bottom w:type="dxa" w:w="20"/>
-              <w:right w:type="dxa" w:w="160"/>
-            </w:tcMar>
-          </w:tcPr>
-          <w:p>
-            <w:r>
-              <w:rPr>
-                <w:rFonts w:ascii="Arial" w:cs="Arial" w:eastAsia="Arial" w:hAnsi="Arial"/>
-                <w:color w:val="15232E"/>
-                <w:sz w:val="20"/>
-                <w:szCs w:val="20"/>
-              </w:rPr>
-              <w:t xml:space="preserve"/>
-            </w:r>
-          </w:p>
-        </w:tc>
-        <w:tc>
-          <w:tcPr>
-            <w:tcW w:type="dxa" w:w="1498"/>
-            <w:tcBorders>
-              <w:top w:val="none" w:color="FFFFFF" w:sz="0"/>
-              <w:left w:val="none" w:color="FFFFFF" w:sz="0"/>
-              <w:bottom w:val="none" w:color="FFFFFF" w:sz="0"/>
-              <w:right w:val="none" w:color="FFFFFF" w:sz="0"/>
-            </w:tcBorders>
-            <w:tcMar>
-              <w:top w:type="dxa" w:w="120"/>
-              <w:left w:type="dxa" w:w="0"/>
-              <w:bottom w:type="dxa" w:w="20"/>
-              <w:right w:type="dxa" w:w="80"/>
-            </w:tcMar>
-          </w:tcPr>
-          <w:p>
-            <w:r>
-              <w:rPr>
-                <w:rFonts w:ascii="Arial" w:cs="Arial" w:eastAsia="Arial" w:hAnsi="Arial"/>
-                <w:b/>
-                <w:bCs/>
-                <w:color w:val="5A6B78"/>
-                <w:sz w:val="18"/>
-                <w:szCs w:val="18"/>
-              </w:rPr>
-              <w:t xml:space="preserve">Time zone</w:t>
-            </w:r>
-          </w:p>
-        </w:tc>
-        <w:tc>
-          <w:tcPr>
-            <w:tcW w:type="dxa" w:w="3182"/>
             <w:tcBorders>
               <w:top w:val="none" w:color="FFFFFF" w:sz="0"/>
               <w:left w:val="none" w:color="FFFFFF" w:sz="0"/>

</xml_diff>

<commit_message>
Authorization reframed as project + testing authorization (redesign-first, testing still authorized)
</commit_message>
<xml_diff>
--- a/clients/_templates/LeBlanc-Security-Testing-Authorization.docx
+++ b/clients/_templates/LeBlanc-Security-Testing-Authorization.docx
@@ -30,7 +30,7 @@
           <w:sz w:val="40"/>
           <w:szCs w:val="40"/>
         </w:rPr>
-        <w:t xml:space="preserve">Website Security Testing Authorization</w:t>
+        <w:t xml:space="preserve">Website Project &amp; Testing Authorization</w:t>
       </w:r>
     </w:p>
     <w:p>
@@ -44,7 +44,7 @@
           <w:sz w:val="20"/>
           <w:szCs w:val="20"/>
         </w:rPr>
-        <w:t xml:space="preserve">This form gives LeBlanc Solutions written permission to test the security of the websites listed below. We do not test any system without it. Please complete every section, initial the testing type you approve, and sign at the end.</w:t>
+        <w:t xml:space="preserve">Every LeBlanc project starts with a security check of your current website, and any new website we build is tested before launch. This form gives us written permission to do that. We never test a website without it. Please complete every section, initial the testing type you approve, and sign at the end.</w:t>
       </w:r>
     </w:p>
     <w:p>
@@ -449,7 +449,7 @@
           <w:sz w:val="20"/>
           <w:szCs w:val="20"/>
         </w:rPr>
-        <w:t xml:space="preserve">Only the websites listed here may be tested. Anything not listed is out of scope.</w:t>
+        <w:t xml:space="preserve">List your current website(s). Only these, plus the new website we build for you, may be tested. Anything else is out of scope.</w:t>
       </w:r>
     </w:p>
     <w:tbl>
@@ -897,7 +897,7 @@
           <w:sz w:val="20"/>
           <w:szCs w:val="20"/>
         </w:rPr>
-        <w:t xml:space="preserve">Recon testing (standard)</w:t>
+        <w:t xml:space="preserve">Recon testing (standard, part of every project)</w:t>
       </w:r>
       <w:r>
         <w:rPr>
@@ -1288,6 +1288,25 @@
           <w:sz w:val="20"/>
           <w:szCs w:val="20"/>
         </w:rPr>
+        <w:t xml:space="preserve">If we build you a new website, we also test it before launch. That testing is covered by this form.</w:t>
+      </w:r>
+    </w:p>
+    <w:p>
+      <w:pPr>
+        <w:pStyle w:val="ListParagraph"/>
+        <w:numPr>
+          <w:ilvl w:val="0"/>
+          <w:numId w:val="2"/>
+        </w:numPr>
+        <w:spacing w:after="60" w:line="264"/>
+      </w:pPr>
+      <w:r>
+        <w:rPr>
+          <w:rFonts w:ascii="Arial" w:cs="Arial" w:eastAsia="Arial" w:hAnsi="Arial"/>
+          <w:color w:val="15232E"/>
+          <w:sz w:val="20"/>
+          <w:szCs w:val="20"/>
+        </w:rPr>
         <w:t xml:space="preserve">We do not run denial-of-service attacks, attempt to take sites offline, or deliberately delete or change your data.</w:t>
       </w:r>
     </w:p>
@@ -1733,7 +1752,7 @@
           <w:sz w:val="20"/>
           <w:szCs w:val="20"/>
         </w:rPr>
-        <w:t xml:space="preserve">This authorization covers only the websites, testing types and dates above. Any change must be agreed in writing.</w:t>
+        <w:t xml:space="preserve">This authorization covers only the websites, testing types and dates above, plus the new website we build for you. Any change must be agreed in writing.</w:t>
       </w:r>
     </w:p>
     <w:p>
@@ -2321,7 +2340,7 @@
     <w:sectPr>
       <w:footerReference w:type="default" r:id="rId6"/>
       <w:pgSz w:w="12240" w:h="15840" w:orient="portrait"/>
-      <w:pgMar w:top="1080" w:right="1440" w:bottom="1080" w:left="1440" w:header="708" w:footer="708" w:gutter="0"/>
+      <w:pgMar w:top="820" w:right="1300" w:bottom="820" w:left="1300" w:header="708" w:footer="708" w:gutter="0"/>
       <w:pgNumType/>
       <w:docGrid w:linePitch="360"/>
     </w:sectPr>

</xml_diff>